<commit_message>
feat: Precificação Cilia - nova funcionalidade
- CiliaPricingController: lista OS com peças pendentes de precificação
- Views: tela de listagem com filtros e tela de precificação detalhada
- CiliaPricingPolicy: controle de acesso (admin/manager/additional)
- Migration: adiciona cilia_priced_at e cilia_priced_by_id em order_services
- Rota e menu: /cilia_pricing com entrada no menu lateral
- OrderService: novo belongs_to :cilia_priced_by e scopes cilia_pending/completed
- Fix: adicionado vehicle_model_id na tabela vehicles do servidor (SQL direto)
</commit_message>
<xml_diff>
--- a/Requisição_Serviços_InstaSolutions.docx
+++ b/Requisição_Serviços_InstaSolutions.docx
@@ -88,6 +88,9 @@
       <w:r>
         <w:t>Razão Social / Nome Fantasia:______________________________________________________</w:t>
       </w:r>
+      <w:r>
+        <w:t>_</w:t>
+      </w:r>
     </w:p>
     <w:p>
       <w:pPr>
@@ -164,6 +167,9 @@
       <w:r>
         <w:t>___________________I.M__________________</w:t>
       </w:r>
+      <w:r>
+        <w:t>_</w:t>
+      </w:r>
     </w:p>
     <w:p>
       <w:pPr>
@@ -172,13 +178,19 @@
       <w:r>
         <w:t>Endereço:_____________________________________ Bairro:_____________________________</w:t>
       </w:r>
+      <w:r>
+        <w:t>_</w:t>
+      </w:r>
     </w:p>
     <w:p>
       <w:pPr>
         <w:spacing w:after="0"/>
       </w:pPr>
       <w:r>
-        <w:t>Cidade:__________________________________Estado:__________________________________</w:t>
+        <w:t>Cidade:__________________________Estado:_________</w:t>
+      </w:r>
+      <w:r>
+        <w:t>Telefone:_________________________</w:t>
       </w:r>
     </w:p>
     <w:p>
@@ -2667,14 +2679,7 @@
         <w:sz w:val="20"/>
         <w:szCs w:val="20"/>
       </w:rPr>
-      <w:t>SUPERINTENDÊNCIA ESTADUAL DO IBGE/RS</w:t>
-    </w:r>
-    <w:r>
-      <w:rPr>
-        <w:sz w:val="20"/>
-        <w:szCs w:val="20"/>
-      </w:rPr>
-      <w:t xml:space="preserve"> </w:t>
+      <w:t xml:space="preserve">SUPERINTENDÊNCIA ESTADUAL DO IBGE/RS </w:t>
     </w:r>
     <w:r>
       <w:t xml:space="preserve"> </w:t>
@@ -2744,21 +2749,7 @@
       <w:t xml:space="preserve"> </w:t>
     </w:r>
     <w:r>
-      <w:t xml:space="preserve">Av. </w:t>
-    </w:r>
-    <w:proofErr w:type="spellStart"/>
-    <w:r>
-      <w:t>Augusto</w:t>
-    </w:r>
-    <w:proofErr w:type="spellEnd"/>
-    <w:r>
-      <w:t xml:space="preserve"> de Carvalho, no 1.205,</w:t>
-    </w:r>
-    <w:r>
-      <w:t xml:space="preserve"> </w:t>
-    </w:r>
-    <w:r>
-      <w:t>Praia de Belas, na cidade de Porto Alegre/RS</w:t>
+      <w:t>Av. Augusto de Carvalho, no 1.205, Praia de Belas, na cidade de Porto Alegre/RS</w:t>
     </w:r>
     <w:r>
       <w:t xml:space="preserve">                                                                                     </w:t>

</xml_diff>